<commit_message>
opdatering af mikroskop-model. Og journalspørgsmål til 'mikroskopi af celler'
</commit_message>
<xml_diff>
--- a/Øvelser/Biologi/mikroskopi-af-celler/mikroskopi-af-celler.docx
+++ b/Øvelser/Biologi/mikroskopi-af-celler/mikroskopi-af-celler.docx
@@ -70,7 +70,7 @@
       </w:r>
     </w:p>
     <w:bookmarkEnd w:id="19"/>
-    <w:bookmarkStart w:id="30" w:name="fremgangsmåde"/>
+    <w:bookmarkStart w:id="33" w:name="fremgangsmåde"/>
     <w:p>
       <w:pPr>
         <w:pStyle w:val="Heading2"/>
@@ -79,7 +79,7 @@
         <w:t xml:space="preserve">Fremgangsmåde</w:t>
       </w:r>
     </w:p>
-    <w:bookmarkStart w:id="20" w:name="sådan-indstiller-i-mikroskopet"/>
+    <w:bookmarkStart w:id="23" w:name="sådan-indstiller-i-mikroskopet"/>
     <w:p>
       <w:pPr>
         <w:pStyle w:val="Heading3"/>
@@ -121,7 +121,7 @@
         </w:numPr>
       </w:pPr>
       <w:r>
-        <w:t xml:space="preserve">Se fra siden, og kør objektivet så langt ned mod præparatet som muligt med grovskruen.</w:t>
+        <w:t xml:space="preserve">Kør krydsbordet helt ned med grovskruen.</w:t>
       </w:r>
     </w:p>
     <w:p>
@@ -133,7 +133,7 @@
         </w:numPr>
       </w:pPr>
       <w:r>
-        <w:t xml:space="preserve">Se i okularet, og skru langsomt objektivet opad, indtil billedet er skarpt. Finindstil med finskruen.</w:t>
+        <w:t xml:space="preserve">Se på skærmen, og kør krydsbordet langsomt op med grovskruen, indtil billedet er skarpt.</w:t>
       </w:r>
     </w:p>
     <w:p>
@@ -157,11 +157,128 @@
         </w:numPr>
       </w:pPr>
       <w:r>
-        <w:t xml:space="preserve">Skift først derefter til større forstørrelse (10× og dernæst 40×). Efterjustér kun med finskruen.</w:t>
-      </w:r>
-    </w:p>
-    <w:bookmarkEnd w:id="20"/>
-    <w:bookmarkStart w:id="21" w:name="a.-løghinde"/>
+        <w:t xml:space="preserve">Skift til næste forstørrelse (10× og dernæst 40×), og find skarpt billede igen med grovskruen. Mikroskopet har ingen finskrue, så gå langsomt frem, især ved 40×.</w:t>
+      </w:r>
+    </w:p>
+    <w:tbl>
+      <w:tblPr>
+        <w:tblStyle w:val="Table"/>
+        <w:tblLook w:firstRow="0" w:lastRow="0" w:firstColumn="0" w:lastColumn="0" w:noHBand="0" w:noVBand="0" w:val="0000"/>
+        <w:tblBorders>
+          <w:top w:val="single" w:sz="4" w:space="0" w:color="00A047"/>
+          <w:left w:val="single" w:sz="24" w:space="0" w:color="00A047"/>
+          <w:bottom w:val="single" w:sz="4" w:space="0" w:color="00A047"/>
+          <w:right w:val="single" w:sz="4" w:space="0" w:color="00A047"/>
+        </w:tblBorders>
+        <w:tblCellMar>
+          <w:left w:w="144" w:type="dxa"/>
+          <w:right w:w="144" w:type="dxa"/>
+        </w:tblCellMar>
+        <w:tblLook w:firstRow="0" w:lastRow="0" w:firstColumn="0" w:lastColumn="0" w:noHBand="0" w:noVBand="0" w:val="0000"/>
+      </w:tblPr>
+      <w:tr>
+        <w:trPr>
+          <w:cantSplit/>
+        </w:trPr>
+        <w:tc>
+          <w:tcPr>
+            <w:shd w:color="auto" w:fill="ccf1e3" w:val="clear"/>
+            <w:tcMar>
+              <w:top w:w="92" w:type="dxa"/>
+              <w:bottom w:w="92" w:type="dxa"/>
+            </w:tcMar>
+          </w:tcPr>
+          <w:p>
+            <w:pPr>
+              <w:pStyle w:val="FirstParagraph"/>
+              <w:keepNext/>
+            </w:pPr>
+            <w:pPr>
+              <w:spacing w:before="0" w:after="0"/>
+              <w:textAlignment w:val="center"/>
+            </w:pPr>
+            <w:r>
+              <w:drawing>
+                <wp:inline>
+                  <wp:extent cx="152400" cy="152400"/>
+                  <wp:effectExtent b="0" l="0" r="0" t="0"/>
+                  <wp:docPr descr="" title="" id="21" name="Picture"/>
+                  <a:graphic>
+                    <a:graphicData uri="http://schemas.openxmlformats.org/drawingml/2006/picture">
+                      <pic:pic>
+                        <pic:nvPicPr>
+                          <pic:cNvPr descr="/Applications/quarto/share/formats/docx/tip.png" id="22" name="Picture"/>
+                          <pic:cNvPicPr>
+                            <a:picLocks noChangeArrowheads="1" noChangeAspect="1"/>
+                          </pic:cNvPicPr>
+                        </pic:nvPicPr>
+                        <pic:blipFill>
+                          <a:blip r:embed="rId20"/>
+                          <a:stretch>
+                            <a:fillRect/>
+                          </a:stretch>
+                        </pic:blipFill>
+                        <pic:spPr bwMode="auto">
+                          <a:xfrm>
+                            <a:off x="0" y="0"/>
+                            <a:ext cx="152400" cy="152400"/>
+                          </a:xfrm>
+                          <a:prstGeom prst="rect">
+                            <a:avLst/>
+                          </a:prstGeom>
+                          <a:noFill/>
+                          <a:ln w="9525">
+                            <a:noFill/>
+                            <a:headEnd/>
+                            <a:tailEnd/>
+                          </a:ln>
+                        </pic:spPr>
+                      </pic:pic>
+                    </a:graphicData>
+                  </a:graphic>
+                </wp:inline>
+              </w:drawing>
+            </w:r>
+            <w:r>
+              <w:t xml:space="preserve"> </w:t>
+            </w:r>
+            <w:r>
+              <w:t xml:space="preserve"> </w:t>
+            </w:r>
+            <w:r>
+              <w:t xml:space="preserve">Billeder og pile</w:t>
+            </w:r>
+          </w:p>
+        </w:tc>
+      </w:tr>
+      <w:tr>
+        <w:trPr>
+          <w:cantSplit/>
+        </w:trPr>
+        <w:tc>
+          <w:tcPr>
+            <w:tcMar>
+              <w:top w:w="108" w:type="dxa"/>
+              <w:bottom w:w="108" w:type="dxa"/>
+            </w:tcMar>
+          </w:tcPr>
+          <w:p>
+            <w:pPr>
+              <w:pStyle w:val="BodyText"/>
+            </w:pPr>
+            <w:pPr>
+              <w:spacing w:before="16" w:after="16"/>
+            </w:pPr>
+            <w:r>
+              <w:t xml:space="preserve">Brug mikroskopets kamera til at tage et billede af det, I ser. Sæt bagefter pile ind på billedet med forklaring af de strukturer, I kan genkende (fx cellevæg, cellekerne, grønkorn), og sammenlign med de tilsvarende figurer i lærebogen.</w:t>
+            </w:r>
+          </w:p>
+          <w:p/>
+        </w:tc>
+      </w:tr>
+    </w:tbl>
+    <w:bookmarkEnd w:id="23"/>
+    <w:bookmarkStart w:id="24" w:name="a.-løghinde"/>
     <w:p>
       <w:pPr>
         <w:pStyle w:val="Heading3"/>
@@ -215,11 +332,11 @@
         </w:numPr>
       </w:pPr>
       <w:r>
-        <w:t xml:space="preserve">Mikroskopér ved 40×, 100× og 400×, og tegn det, I ser. Løgceller kan ses tydeligt uden farvning.</w:t>
-      </w:r>
-    </w:p>
-    <w:bookmarkEnd w:id="21"/>
-    <w:bookmarkStart w:id="22" w:name="b.-vandpest"/>
+        <w:t xml:space="preserve">Mikroskopér ved 40×, 100× og 400×, og fotografér cellerne ved den forstørrelse, hvor de ses tydeligst. Løgceller kan ses tydeligt uden farvning.</w:t>
+      </w:r>
+    </w:p>
+    <w:bookmarkEnd w:id="24"/>
+    <w:bookmarkStart w:id="25" w:name="b.-vandpest"/>
     <w:p>
       <w:pPr>
         <w:pStyle w:val="Heading3"/>
@@ -273,11 +390,11 @@
         </w:numPr>
       </w:pPr>
       <w:r>
-        <w:t xml:space="preserve">Tegn nogle få celler med grønkorn.</w:t>
-      </w:r>
-    </w:p>
-    <w:bookmarkEnd w:id="22"/>
-    <w:bookmarkStart w:id="29" w:name="c.-kindskrab"/>
+        <w:t xml:space="preserve">Fotografér nogle få celler med grønkorn.</w:t>
+      </w:r>
+    </w:p>
+    <w:bookmarkEnd w:id="25"/>
+    <w:bookmarkStart w:id="32" w:name="c.-kindskrab"/>
     <w:p>
       <w:pPr>
         <w:pStyle w:val="Heading3"/>
@@ -343,7 +460,7 @@
         </w:numPr>
       </w:pPr>
       <w:r>
-        <w:t xml:space="preserve">Mikroskopér ved 400×. Cellerne ligger spredt og er meget flade — skru langsomt på finskruen. Tegn en enkelt celle.</w:t>
+        <w:t xml:space="preserve">Mikroskopér ved 400×. Cellerne ligger spredt og er meget flade — kør grovskruen langsomt og forsigtigt. Fotografér en enkelt celle.</w:t>
       </w:r>
     </w:p>
     <w:p>
@@ -400,18 +517,18 @@
                 <wp:inline>
                   <wp:extent cx="152400" cy="152400"/>
                   <wp:effectExtent b="0" l="0" r="0" t="0"/>
-                  <wp:docPr descr="" title="" id="24" name="Picture"/>
+                  <wp:docPr descr="" title="" id="27" name="Picture"/>
                   <a:graphic>
                     <a:graphicData uri="http://schemas.openxmlformats.org/drawingml/2006/picture">
                       <pic:pic>
                         <pic:nvPicPr>
-                          <pic:cNvPr descr="/Applications/quarto/share/formats/docx/note.png" id="25" name="Picture"/>
+                          <pic:cNvPr descr="/Applications/quarto/share/formats/docx/note.png" id="28" name="Picture"/>
                           <pic:cNvPicPr>
                             <a:picLocks noChangeArrowheads="1" noChangeAspect="1"/>
                           </pic:cNvPicPr>
                         </pic:nvPicPr>
                         <pic:blipFill>
-                          <a:blip r:embed="rId23"/>
+                          <a:blip r:embed="rId26"/>
                           <a:stretch>
                             <a:fillRect/>
                           </a:stretch>
@@ -469,7 +586,7 @@
               </w:numPr>
             </w:pPr>
             <w:r>
-              <w:t xml:space="preserve">Lysmikroskop med 4×, 10× og 40× objektiv</w:t>
+              <w:t xml:space="preserve">Digitalt mikroskop med 7″ skærm og indbygget kamera (fx MatataStudio MT3-5), med 4×, 10× og 40× objektiv</w:t>
             </w:r>
           </w:p>
           <w:p>
@@ -622,18 +739,18 @@
                 <wp:inline>
                   <wp:extent cx="152400" cy="152400"/>
                   <wp:effectExtent b="0" l="0" r="0" t="0"/>
-                  <wp:docPr descr="" title="" id="27" name="Picture"/>
+                  <wp:docPr descr="" title="" id="30" name="Picture"/>
                   <a:graphic>
                     <a:graphicData uri="http://schemas.openxmlformats.org/drawingml/2006/picture">
                       <pic:pic>
                         <pic:nvPicPr>
-                          <pic:cNvPr descr="/Applications/quarto/share/formats/docx/important.png" id="28" name="Picture"/>
+                          <pic:cNvPr descr="/Applications/quarto/share/formats/docx/important.png" id="31" name="Picture"/>
                           <pic:cNvPicPr>
                             <a:picLocks noChangeArrowheads="1" noChangeAspect="1"/>
                           </pic:cNvPicPr>
                         </pic:nvPicPr>
                         <pic:blipFill>
-                          <a:blip r:embed="rId26"/>
+                          <a:blip r:embed="rId29"/>
                           <a:stretch>
                             <a:fillRect/>
                           </a:stretch>
@@ -794,8 +911,99 @@
         </w:tc>
       </w:tr>
     </w:tbl>
-    <w:bookmarkEnd w:id="29"/>
-    <w:bookmarkEnd w:id="30"/>
+    <w:bookmarkEnd w:id="32"/>
+    <w:bookmarkEnd w:id="33"/>
+    <w:bookmarkStart w:id="34" w:name="journalspørgsmål"/>
+    <w:p>
+      <w:pPr>
+        <w:pStyle w:val="Heading2"/>
+      </w:pPr>
+      <w:r>
+        <w:t xml:space="preserve">Journalspørgsmål</w:t>
+      </w:r>
+    </w:p>
+    <w:p>
+      <w:pPr>
+        <w:pStyle w:val="Compact"/>
+        <w:numPr>
+          <w:ilvl w:val="0"/>
+          <w:numId w:val="1007"/>
+        </w:numPr>
+      </w:pPr>
+      <w:r>
+        <w:t xml:space="preserve">Sammenlign jeres tre billeder: hvilke strukturer så I i alle tre celletyper, og hvilke så I kun i nogle af dem (fx cellevæg, cellekerne, grønkorn)?</w:t>
+      </w:r>
+    </w:p>
+    <w:p>
+      <w:pPr>
+        <w:pStyle w:val="Compact"/>
+        <w:numPr>
+          <w:ilvl w:val="0"/>
+          <w:numId w:val="1007"/>
+        </w:numPr>
+      </w:pPr>
+      <w:r>
+        <w:t xml:space="preserve">Løg- og vandpestceller har en tydelig, firkantet form, mens kindcellerne ligger uregelmæssigt og flade. Forklar forskellen ud fra, om cellerne har en cellevæg eller ej.</w:t>
+      </w:r>
+    </w:p>
+    <w:p>
+      <w:pPr>
+        <w:pStyle w:val="Compact"/>
+        <w:numPr>
+          <w:ilvl w:val="0"/>
+          <w:numId w:val="1007"/>
+        </w:numPr>
+      </w:pPr>
+      <w:r>
+        <w:t xml:space="preserve">Kindcellerne skulle farves med methylenblåt for at kunne ses tydeligt, mens løg- og vandpestcellerne kunne mikroskoperes ufarvede. Hvad er årsagen til den forskel?</w:t>
+      </w:r>
+    </w:p>
+    <w:p>
+      <w:pPr>
+        <w:pStyle w:val="Compact"/>
+        <w:numPr>
+          <w:ilvl w:val="0"/>
+          <w:numId w:val="1007"/>
+        </w:numPr>
+      </w:pPr>
+      <w:r>
+        <w:t xml:space="preserve">Hvis I så grønkornene i vandpestcellen bevæge sig rundt i cellen (plasmastrømning): hvad er formålet med denne bevægelse, og hvilken funktion har grønkornene?</w:t>
+      </w:r>
+    </w:p>
+    <w:p>
+      <w:pPr>
+        <w:pStyle w:val="Compact"/>
+        <w:numPr>
+          <w:ilvl w:val="0"/>
+          <w:numId w:val="1007"/>
+        </w:numPr>
+      </w:pPr>
+      <w:r>
+        <w:t xml:space="preserve">Sæt en omtrentlig størrelsesangivelse på et af jeres billeder (fx</w:t>
+      </w:r>
+      <w:r>
+        <w:t xml:space="preserve"> </w:t>
+      </w:r>
+      <w:r>
+        <w:t xml:space="preserve">“celle ca. __ µm lang”</w:t>
+      </w:r>
+      <w:r>
+        <w:t xml:space="preserve">), og forklar kort, hvordan I er nået frem til tallet ud fra forstørrelsen.</w:t>
+      </w:r>
+    </w:p>
+    <w:p>
+      <w:pPr>
+        <w:pStyle w:val="Compact"/>
+        <w:numPr>
+          <w:ilvl w:val="0"/>
+          <w:numId w:val="1007"/>
+        </w:numPr>
+      </w:pPr>
+      <w:r>
+        <w:t xml:space="preserve">Sammenlign et af jeres annoterede billeder med den tilsvarende figur i lærebogen. Er der strukturer, bogens figur viser, som I ikke selv kunne få øje på — eller omvendt? Hvad kan forklare en eventuel forskel?</w:t>
+      </w:r>
+    </w:p>
+    <w:bookmarkEnd w:id="34"/>
     <w:sectPr>
       <w:headerReference r:id="rId7" w:type="default"/>
       <w:footerReference r:id="rId8" w:type="default"/>
@@ -1469,6 +1677,36 @@
   </w:num>
   <w:num w:numId="1006">
     <w:abstractNumId w:val="991"/>
+  </w:num>
+  <w:num w:numId="1007">
+    <w:abstractNumId w:val="99411"/>
+    <w:lvlOverride w:ilvl="0">
+      <w:startOverride w:val="1"/>
+    </w:lvlOverride>
+    <w:lvlOverride w:ilvl="1">
+      <w:startOverride w:val="1"/>
+    </w:lvlOverride>
+    <w:lvlOverride w:ilvl="2">
+      <w:startOverride w:val="1"/>
+    </w:lvlOverride>
+    <w:lvlOverride w:ilvl="3">
+      <w:startOverride w:val="1"/>
+    </w:lvlOverride>
+    <w:lvlOverride w:ilvl="4">
+      <w:startOverride w:val="1"/>
+    </w:lvlOverride>
+    <w:lvlOverride w:ilvl="5">
+      <w:startOverride w:val="1"/>
+    </w:lvlOverride>
+    <w:lvlOverride w:ilvl="6">
+      <w:startOverride w:val="1"/>
+    </w:lvlOverride>
+    <w:lvlOverride w:ilvl="7">
+      <w:startOverride w:val="1"/>
+    </w:lvlOverride>
+    <w:lvlOverride w:ilvl="8">
+      <w:startOverride w:val="1"/>
+    </w:lvlOverride>
   </w:num>
 </w:numbering>
 </file>

</xml_diff>